<commit_message>
Agregué últimas canciones al header
</commit_message>
<xml_diff>
--- a/Work/Te Busqué Jesús Adrián Romero ft Bryan Sandoval.docx
+++ b/Work/Te Busqué Jesús Adrián Romero ft Bryan Sandoval.docx
@@ -171,8 +171,13 @@
         <w:t>F</w:t>
       </w:r>
       <w:r>
-        <w:t xml:space="preserve">                                                                              A         A</w:t>
-      </w:r>
+        <w:t xml:space="preserve">                                                                              A         </w:t>
+      </w:r>
+      <w:proofErr w:type="spellStart"/>
+      <w:r>
+        <w:t>A</w:t>
+      </w:r>
+      <w:proofErr w:type="spellEnd"/>
       <w:r>
         <w:rPr>
           <w:sz w:val="2"/>
@@ -231,6 +236,7 @@
     <w:p>
       <w:pPr>
         <w:spacing w:after="0"/>
+        <w:jc w:val="both"/>
       </w:pPr>
       <w:r>
         <w:t>Entre los hoteles, en las plazas y los trenes te busqué</w:t>
@@ -252,9 +258,11 @@
       <w:r>
         <w:t xml:space="preserve">         </w:t>
       </w:r>
+      <w:proofErr w:type="spellStart"/>
       <w:r>
         <w:t>C</w:t>
       </w:r>
+      <w:proofErr w:type="spellEnd"/>
       <w:r>
         <w:rPr>
           <w:sz w:val="2"/>
@@ -293,9 +301,11 @@
       <w:r>
         <w:t xml:space="preserve"> </w:t>
       </w:r>
+      <w:proofErr w:type="spellStart"/>
       <w:r>
         <w:t>A</w:t>
       </w:r>
+      <w:proofErr w:type="spellEnd"/>
       <w:r>
         <w:rPr>
           <w:sz w:val="2"/>
@@ -372,9 +382,11 @@
       <w:r>
         <w:t xml:space="preserve">      </w:t>
       </w:r>
+      <w:proofErr w:type="spellStart"/>
       <w:r>
         <w:t>C</w:t>
       </w:r>
+      <w:proofErr w:type="spellEnd"/>
       <w:r>
         <w:rPr>
           <w:sz w:val="2"/>
@@ -737,23 +749,33 @@
         <w:t xml:space="preserve"> </w:t>
       </w:r>
       <w:r>
-        <w:t>A#</w:t>
-      </w:r>
-      <w:r>
-        <w:t xml:space="preserve"> </w:t>
-      </w:r>
-      <w:r>
-        <w:t xml:space="preserve"> C </w:t>
-      </w:r>
-      <w:r>
-        <w:t xml:space="preserve"> </w:t>
-      </w:r>
-      <w:r>
-        <w:t xml:space="preserve"> </w:t>
-      </w:r>
+        <w:t>A</w:t>
+      </w:r>
+      <w:proofErr w:type="gramStart"/>
+      <w:r>
+        <w:t>#</w:t>
+      </w:r>
+      <w:r>
+        <w:t xml:space="preserve"> </w:t>
+      </w:r>
+      <w:r>
+        <w:t xml:space="preserve"> C</w:t>
+      </w:r>
+      <w:proofErr w:type="gramEnd"/>
+      <w:r>
+        <w:t xml:space="preserve"> </w:t>
+      </w:r>
+      <w:r>
+        <w:t xml:space="preserve"> </w:t>
+      </w:r>
+      <w:r>
+        <w:t xml:space="preserve"> </w:t>
+      </w:r>
+      <w:proofErr w:type="spellStart"/>
       <w:r>
         <w:t>C</w:t>
       </w:r>
+      <w:proofErr w:type="spellEnd"/>
       <w:r>
         <w:rPr>
           <w:sz w:val="2"/>

</xml_diff>